<commit_message>
drukwerk: Buurtgezinnen-flyer definitief + <strong>-bug in bewerkbare docx
Buurtgezinnen (Wendy) leverde de flyer aangepast terug: hele tekst
getutoyeerd (u -> je), twee zinnen ingekort. Die versie is nu de
hoofdversie (html + pdf), zodat de site hetzelfde toont als wat zij
morgen in hun nieuwsbrief zetten.

Bugfix in maak-partner-pakket.mjs: --dump-dom escapet de textContent
van de <pre> met de extractor-JSON, maar alleen &amp; werd teruggedraaid.
Daardoor belandde letterlijk "<strong>" en "<span class=...>" als
zichtbare tekst in ELKE bewerkbare Word-flyer. Nu worden &lt; &gt;
&quot; &#39; ook gedecodeerd (&amp; als laatste, anders dubbel).
Buurtgezinnen en Dongen opnieuw gegenereerd: 0 letterlijke tags.

Co-Authored-By: Claude Opus 5 (1M context) <noreply@anthropic.com>
</commit_message>
<xml_diff>
--- a/public/drukwerk/flyer-BUURTGEZINNEN2027-bewerkbaar.docx
+++ b/public/drukwerk/flyer-BUURTGEZINNEN2027-bewerkbaar.docx
@@ -45,7 +45,7 @@
                 <w:szCs w:val="22"/>
               </w:rPr>
               <w:drawing>
-                <wp:inline distT="0" distB="0" distL="0" distR="0" wp14:anchorId="7F4617E2" wp14:editId="4DBCF61D">
+                <wp:inline distT="0" distB="0" distL="0" distR="0" wp14:anchorId="3920C3CB" wp14:editId="00FBE778">
                   <wp:extent cx="495300" cy="495300"/>
                   <wp:effectExtent l="0" t="0" r="0" b="0"/>
                   <wp:docPr id="1" name="Afbeelding 1" descr="Leerkwartier-logo"/>
@@ -144,7 +144,7 @@
                 <w:szCs w:val="22"/>
               </w:rPr>
               <w:drawing>
-                <wp:inline distT="0" distB="0" distL="0" distR="0" wp14:anchorId="48551D38" wp14:editId="625DA36F">
+                <wp:inline distT="0" distB="0" distL="0" distR="0" wp14:anchorId="6BF4ED3E" wp14:editId="4BA8D696">
                   <wp:extent cx="1428750" cy="2019048"/>
                   <wp:effectExtent l="0" t="0" r="0" b="635"/>
                   <wp:docPr id="2" name="Afbeelding 2" descr="Partner-logo"/>
@@ -236,7 +236,7 @@
         <w:rPr>
           <w:rFonts w:ascii="Arial" w:hAnsi="Arial" w:cs="Arial"/>
         </w:rPr>
-        <w:t>Zit uw kind in groep 6, 7 of 8? In groep 8 maakt uw kind de Doorstroomtoets. Dat is een grote toets. Oefenen helpt. Maar oefenboeken zijn duur. Bijles is ook duur.</w:t>
+        <w:t>Zit je kind in groep 6, 7 of 8? In groep 8 maakt je kind de Doorstroomtoets. Dat is een grote toets. Oefenen helpt. Maar oefenboeken zijn duur en bijles ook.</w:t>
       </w:r>
     </w:p>
     <w:p>
@@ -248,9 +248,16 @@
       </w:pPr>
       <w:r>
         <w:rPr>
-          <w:rFonts w:ascii="Arial" w:hAnsi="Arial" w:cs="Arial"/>
-        </w:rPr>
-        <w:t>&lt;strong&gt;Daarom is er Leerkwartier.&lt;/strong&gt; Een app waar uw kind gratis kan oefenen. Elke dag een kwartier is genoeg.</w:t>
+          <w:rStyle w:val="Zwaar"/>
+          <w:rFonts w:ascii="Arial" w:hAnsi="Arial" w:cs="Arial"/>
+        </w:rPr>
+        <w:t>Daarom is er Leerkwartier.</w:t>
+      </w:r>
+      <w:r>
+        <w:rPr>
+          <w:rFonts w:ascii="Arial" w:hAnsi="Arial" w:cs="Arial"/>
+        </w:rPr>
+        <w:t xml:space="preserve"> Een app waar je kind gratis kan oefenen. Elke dag een kwartier is genoeg.</w:t>
       </w:r>
     </w:p>
     <w:tbl>
@@ -265,7 +272,7 @@
       </w:tblPr>
       <w:tblGrid>
         <w:gridCol w:w="2100"/>
-        <w:gridCol w:w="7505"/>
+        <w:gridCol w:w="6942"/>
       </w:tblGrid>
       <w:tr>
         <w:trPr>
@@ -309,7 +316,7 @@
                 <w:szCs w:val="22"/>
               </w:rPr>
               <w:drawing>
-                <wp:inline distT="0" distB="0" distL="0" distR="0" wp14:anchorId="5B6D5C91" wp14:editId="6EF87C14">
+                <wp:inline distT="0" distB="0" distL="0" distR="0" wp14:anchorId="27A1E9A1" wp14:editId="25FD4990">
                   <wp:extent cx="1092200" cy="1092200"/>
                   <wp:effectExtent l="0" t="0" r="0" b="0"/>
                   <wp:docPr id="3" name="Afbeelding 3" descr="QR-code"/>
@@ -423,15 +430,22 @@
             </w:pPr>
             <w:r>
               <w:rPr>
+                <w:rStyle w:val="Zwaar"/>
                 <w:rFonts w:ascii="Arial" w:hAnsi="Arial" w:cs="Arial"/>
               </w:rPr>
-              <w:t xml:space="preserve">&lt;strong&gt;Richt de camera van uw telefoon op deze code.&lt;/strong&gt; </w:t>
+              <w:t>Richt de camera van je telefoon op deze code.</w:t>
             </w:r>
             <w:r>
               <w:rPr>
                 <w:rFonts w:ascii="Arial" w:hAnsi="Arial" w:cs="Arial"/>
               </w:rPr>
-              <w:t>Tik op de link die verschijnt. De app opent vanzelf. U hoeft niets te installeren. U hoeft geen account te maken.</w:t>
+              <w:t xml:space="preserve"> </w:t>
+            </w:r>
+            <w:r>
+              <w:rPr>
+                <w:rFonts w:ascii="Arial" w:hAnsi="Arial" w:cs="Arial"/>
+              </w:rPr>
+              <w:t>Tik op de link die verschijnt. De app opent vanzelf. Je hoeft niets te installeren en je hoeft geen account aan te maken.</w:t>
             </w:r>
           </w:p>
           <w:p>
@@ -445,7 +459,33 @@
               <w:rPr>
                 <w:rFonts w:ascii="Arial" w:hAnsi="Arial" w:cs="Arial"/>
               </w:rPr>
-              <w:t>Oefenen is gratis. Voor iedereen. Uw code &lt;span class="qr-code-badge"&gt;BUURTGEZINNEN2027&lt;/span&gt; doet automatisch mee en geeft u een cadeau erbij: &lt;strong&gt;alle extra's van het Familie-pakket, gratis heel 2027&lt;/strong&gt; — tot en met de Doorstroomtoets.</w:t>
+              <w:t xml:space="preserve">Oefenen is gratis. Voor iedereen. Jouw code </w:t>
+            </w:r>
+            <w:r>
+              <w:rPr>
+                <w:rStyle w:val="qr-code-badge"/>
+                <w:rFonts w:ascii="Arial" w:hAnsi="Arial" w:cs="Arial"/>
+              </w:rPr>
+              <w:t>BUURTGEZINNEN2027</w:t>
+            </w:r>
+            <w:r>
+              <w:rPr>
+                <w:rFonts w:ascii="Arial" w:hAnsi="Arial" w:cs="Arial"/>
+              </w:rPr>
+              <w:t xml:space="preserve"> doet automatisch mee en geeft je een cadeau erbij: </w:t>
+            </w:r>
+            <w:r>
+              <w:rPr>
+                <w:rStyle w:val="Zwaar"/>
+                <w:rFonts w:ascii="Arial" w:hAnsi="Arial" w:cs="Arial"/>
+              </w:rPr>
+              <w:t>alle extra's van het Familie-pakket, gratis heel 2027</w:t>
+            </w:r>
+            <w:r>
+              <w:rPr>
+                <w:rFonts w:ascii="Arial" w:hAnsi="Arial" w:cs="Arial"/>
+              </w:rPr>
+              <w:t xml:space="preserve"> — tot en met de Doorstroomtoets.</w:t>
             </w:r>
           </w:p>
           <w:p>
@@ -459,7 +499,20 @@
               <w:rPr>
                 <w:rFonts w:ascii="Arial" w:hAnsi="Arial" w:cs="Arial"/>
               </w:rPr>
-              <w:t>Lukt het scannen niet? Typ dan in de browser:&lt;br&gt;&lt;strong style="white-space:nowrap"&gt;leerkwartier.app/?partner=BUURTGEZINNEN2027&lt;/strong&gt;</w:t>
+              <w:t>Lukt het scannen niet? Typ dan in de browser:</w:t>
+            </w:r>
+            <w:r>
+              <w:rPr>
+                <w:rFonts w:ascii="Arial" w:hAnsi="Arial" w:cs="Arial"/>
+              </w:rPr>
+              <w:br/>
+            </w:r>
+            <w:r>
+              <w:rPr>
+                <w:rStyle w:val="Zwaar"/>
+                <w:rFonts w:ascii="Arial" w:hAnsi="Arial" w:cs="Arial"/>
+              </w:rPr>
+              <w:t>leerkwartier.app/?partner=BUURTGEZINNEN2027</w:t>
             </w:r>
           </w:p>
         </w:tc>
@@ -476,7 +529,7 @@
         <w:rPr>
           <w:rFonts w:ascii="Arial" w:eastAsia="Times New Roman" w:hAnsi="Arial" w:cs="Arial"/>
         </w:rPr>
-        <w:t>Wat kan uw kind doen in de app?</w:t>
+        <w:t>Wat kan je kind doen in de app?</w:t>
       </w:r>
     </w:p>
     <w:p>
@@ -497,7 +550,20 @@
         <w:rPr>
           <w:rFonts w:ascii="Arial" w:hAnsi="Arial" w:cs="Arial"/>
         </w:rPr>
-        <w:t xml:space="preserve"> Een &lt;strong&gt;oefen-toets&lt;/strong&gt; maken. Die lijkt op de echte Doorstroomtoets.</w:t>
+        <w:t xml:space="preserve"> Een </w:t>
+      </w:r>
+      <w:r>
+        <w:rPr>
+          <w:rStyle w:val="Zwaar"/>
+          <w:rFonts w:ascii="Arial" w:hAnsi="Arial" w:cs="Arial"/>
+        </w:rPr>
+        <w:t>oefentoets</w:t>
+      </w:r>
+      <w:r>
+        <w:rPr>
+          <w:rFonts w:ascii="Arial" w:hAnsi="Arial" w:cs="Arial"/>
+        </w:rPr>
+        <w:t xml:space="preserve"> maken. Die lijkt op de echte Doorstroomtoets.</w:t>
       </w:r>
       <w:r>
         <w:rPr>
@@ -516,7 +582,26 @@
         <w:rPr>
           <w:rFonts w:ascii="Arial" w:hAnsi="Arial" w:cs="Arial"/>
         </w:rPr>
-        <w:t xml:space="preserve"> Elke dag een &lt;strong&gt;nieuwe vraag&lt;/strong&gt; oefenen. Met uitleg.</w:t>
+        <w:t xml:space="preserve"> </w:t>
+      </w:r>
+      <w:r>
+        <w:rPr>
+          <w:rFonts w:ascii="Arial" w:hAnsi="Arial" w:cs="Arial"/>
+        </w:rPr>
+        <w:t xml:space="preserve">Elke dag een </w:t>
+      </w:r>
+      <w:r>
+        <w:rPr>
+          <w:rStyle w:val="Zwaar"/>
+          <w:rFonts w:ascii="Arial" w:hAnsi="Arial" w:cs="Arial"/>
+        </w:rPr>
+        <w:t>nieuwe vraag</w:t>
+      </w:r>
+      <w:r>
+        <w:rPr>
+          <w:rFonts w:ascii="Arial" w:hAnsi="Arial" w:cs="Arial"/>
+        </w:rPr>
+        <w:t xml:space="preserve"> oefenen. Met uitleg.</w:t>
       </w:r>
       <w:r>
         <w:rPr>
@@ -535,7 +620,20 @@
         <w:rPr>
           <w:rFonts w:ascii="Arial" w:hAnsi="Arial" w:cs="Arial"/>
         </w:rPr>
-        <w:t xml:space="preserve"> Snapt uw kind iets niet? De app &lt;strong&gt;legt het uit&lt;/strong&gt;. In makkelijke woorden. Net zo lang tot het lukt.</w:t>
+        <w:t xml:space="preserve"> Snapt je kind iets niet? De app </w:t>
+      </w:r>
+      <w:r>
+        <w:rPr>
+          <w:rStyle w:val="Zwaar"/>
+          <w:rFonts w:ascii="Arial" w:hAnsi="Arial" w:cs="Arial"/>
+        </w:rPr>
+        <w:t>legt het uit</w:t>
+      </w:r>
+      <w:r>
+        <w:rPr>
+          <w:rFonts w:ascii="Arial" w:hAnsi="Arial" w:cs="Arial"/>
+        </w:rPr>
+        <w:t>. In makkelijke woorden. Net zo lang tot het lukt.</w:t>
       </w:r>
       <w:r>
         <w:rPr>
@@ -554,7 +652,20 @@
         <w:rPr>
           <w:rFonts w:ascii="Arial" w:hAnsi="Arial" w:cs="Arial"/>
         </w:rPr>
-        <w:t xml:space="preserve"> &lt;strong&gt;Samen oefenen mag ook.&lt;/strong&gt; Met een ouder, een steungezin of iemand anders die helpt.</w:t>
+        <w:t xml:space="preserve"> </w:t>
+      </w:r>
+      <w:r>
+        <w:rPr>
+          <w:rStyle w:val="Zwaar"/>
+          <w:rFonts w:ascii="Arial" w:hAnsi="Arial" w:cs="Arial"/>
+        </w:rPr>
+        <w:t>Samen oefenen mag ook.</w:t>
+      </w:r>
+      <w:r>
+        <w:rPr>
+          <w:rFonts w:ascii="Arial" w:hAnsi="Arial" w:cs="Arial"/>
+        </w:rPr>
+        <w:t xml:space="preserve"> Met een ouder, een steungezin of iemand anders die helpt.</w:t>
       </w:r>
       <w:r>
         <w:rPr>
@@ -573,7 +684,20 @@
         <w:rPr>
           <w:rFonts w:ascii="Arial" w:hAnsi="Arial" w:cs="Arial"/>
         </w:rPr>
-        <w:t xml:space="preserve"> Ook &lt;strong&gt;werkbladen om te printen&lt;/strong&gt;. Handig als internet thuis niet goed werkt.</w:t>
+        <w:t xml:space="preserve"> Ook </w:t>
+      </w:r>
+      <w:r>
+        <w:rPr>
+          <w:rStyle w:val="Zwaar"/>
+          <w:rFonts w:ascii="Arial" w:hAnsi="Arial" w:cs="Arial"/>
+        </w:rPr>
+        <w:t>werkbladen om te printen</w:t>
+      </w:r>
+      <w:r>
+        <w:rPr>
+          <w:rFonts w:ascii="Arial" w:hAnsi="Arial" w:cs="Arial"/>
+        </w:rPr>
+        <w:t>. Handig als internet thuis niet goed werkt.</w:t>
       </w:r>
     </w:p>
     <w:p>
@@ -608,13 +732,7 @@
         <w:rPr>
           <w:rFonts w:ascii="Arial" w:hAnsi="Arial" w:cs="Arial"/>
         </w:rPr>
-        <w:t xml:space="preserve"> </w:t>
-      </w:r>
-      <w:r>
-        <w:rPr>
-          <w:rFonts w:ascii="Arial" w:hAnsi="Arial" w:cs="Arial"/>
-        </w:rPr>
-        <w:t>Oefenen is gratis en blijft gratis. Dat beloven we, tot en met 2031.</w:t>
+        <w:t xml:space="preserve"> Oefenen is gratis en blijft gratis. Dat beloven we, tot en met 2031.</w:t>
       </w:r>
       <w:r>
         <w:rPr>
@@ -633,7 +751,7 @@
         <w:rPr>
           <w:rFonts w:ascii="Arial" w:hAnsi="Arial" w:cs="Arial"/>
         </w:rPr>
-        <w:t xml:space="preserve"> Met uw code zijn ook alle Familie-extra's gratis, heel 2027. Er gaat nooit zomaar geld af.</w:t>
+        <w:t xml:space="preserve"> Met je code zijn ook alle Familie-extra's gratis, heel 2027.</w:t>
       </w:r>
       <w:r>
         <w:rPr>
@@ -671,7 +789,13 @@
         <w:rPr>
           <w:rFonts w:ascii="Arial" w:hAnsi="Arial" w:cs="Arial"/>
         </w:rPr>
-        <w:t xml:space="preserve"> Wij vragen niet om uw gegevens. Wij verkopen ook niets door.</w:t>
+        <w:t xml:space="preserve"> </w:t>
+      </w:r>
+      <w:r>
+        <w:rPr>
+          <w:rFonts w:ascii="Arial" w:hAnsi="Arial" w:cs="Arial"/>
+        </w:rPr>
+        <w:t>Wij vragen niet om jouw gegevens. Wij verkopen ook niets door.</w:t>
       </w:r>
     </w:p>
     <w:tbl>
@@ -731,7 +855,7 @@
               </w:rPr>
               <w:lastRenderedPageBreak/>
               <w:drawing>
-                <wp:inline distT="0" distB="0" distL="0" distR="0" wp14:anchorId="441266DF" wp14:editId="413A270A">
+                <wp:inline distT="0" distB="0" distL="0" distR="0" wp14:anchorId="728CCDE7" wp14:editId="7A1F834E">
                   <wp:extent cx="908050" cy="2019048"/>
                   <wp:effectExtent l="0" t="0" r="6350" b="635"/>
                   <wp:docPr id="4" name="Afbeelding 4" descr="Partner-logo"/>
@@ -810,15 +934,16 @@
             </w:pPr>
             <w:r>
               <w:rPr>
+                <w:rStyle w:val="Zwaar"/>
                 <w:rFonts w:ascii="Arial" w:hAnsi="Arial" w:cs="Arial"/>
               </w:rPr>
-              <w:t xml:space="preserve">&lt;strong&gt;U krijgt deze tip via Buurtgezinnen.&lt;/strong&gt; </w:t>
+              <w:t>Je krijgt deze tip via Buurtgezinnen.</w:t>
             </w:r>
             <w:r>
               <w:rPr>
                 <w:rFonts w:ascii="Arial" w:hAnsi="Arial" w:cs="Arial"/>
               </w:rPr>
-              <w:t>Het aanbod is echt gratis voor u. Buurtgezinnen betaalt hier niets voor en u ook niet.</w:t>
+              <w:t xml:space="preserve"> Het aanbod is voor jou gratis!</w:t>
             </w:r>
           </w:p>
         </w:tc>
@@ -1521,6 +1646,20 @@
       <w:szCs w:val="40"/>
     </w:rPr>
   </w:style>
+  <w:style w:type="character" w:styleId="Zwaar">
+    <w:name w:val="Strong"/>
+    <w:basedOn w:val="Standaardalinea-lettertype"/>
+    <w:uiPriority w:val="22"/>
+    <w:qFormat/>
+    <w:rPr>
+      <w:b/>
+      <w:bCs/>
+    </w:rPr>
+  </w:style>
+  <w:style w:type="character" w:customStyle="1" w:styleId="qr-code-badge">
+    <w:name w:val="qr-code-badge"/>
+    <w:basedOn w:val="Standaardalinea-lettertype"/>
+  </w:style>
   <w:style w:type="character" w:customStyle="1" w:styleId="vink1">
     <w:name w:val="vink1"/>
     <w:basedOn w:val="Standaardalinea-lettertype"/>

</xml_diff>

<commit_message>
drukwerk: Buurtgezinnen-flyer met woordmerk-logo (versie A) + varianten B/C
Wendy (22 sep 15:29): het bordje-logo moest hun groene woordmerk worden,
boven en onder. Drie versies gestuurd (A rustig, B groen-accent, C logo
boven + tip-zin); Mark: zet A alvast op de site. A = hoofdversie
(html/pdf/docx), B en C staan ernaast als bestand. logo-buurtgezinnen.png
is nu het woordmerk, het bordje bewaard als -bordje.png.

Co-Authored-By: Claude Opus 5 (1M context) <noreply@anthropic.com>
</commit_message>
<xml_diff>
--- a/public/drukwerk/flyer-BUURTGEZINNEN2027-bewerkbaar.docx
+++ b/public/drukwerk/flyer-BUURTGEZINNEN2027-bewerkbaar.docx
@@ -45,7 +45,7 @@
                 <w:szCs w:val="22"/>
               </w:rPr>
               <w:drawing>
-                <wp:inline distT="0" distB="0" distL="0" distR="0" wp14:anchorId="3920C3CB" wp14:editId="00FBE778">
+                <wp:inline distT="0" distB="0" distL="0" distR="0" wp14:anchorId="39EACA5B" wp14:editId="7A5C66C0">
                   <wp:extent cx="495300" cy="495300"/>
                   <wp:effectExtent l="0" t="0" r="0" b="0"/>
                   <wp:docPr id="1" name="Afbeelding 1" descr="Leerkwartier-logo"/>
@@ -144,9 +144,9 @@
                 <w:szCs w:val="22"/>
               </w:rPr>
               <w:drawing>
-                <wp:inline distT="0" distB="0" distL="0" distR="0" wp14:anchorId="6BF4ED3E" wp14:editId="4BA8D696">
-                  <wp:extent cx="1428750" cy="2019048"/>
-                  <wp:effectExtent l="0" t="0" r="0" b="635"/>
+                <wp:inline distT="0" distB="0" distL="0" distR="0" wp14:anchorId="69CAA28D" wp14:editId="271F21BA">
+                  <wp:extent cx="1428750" cy="914479"/>
+                  <wp:effectExtent l="0" t="0" r="0" b="0"/>
                   <wp:docPr id="2" name="Afbeelding 2" descr="Partner-logo"/>
                   <wp:cNvGraphicFramePr>
                     <a:graphicFrameLocks xmlns:a="http://schemas.openxmlformats.org/drawingml/2006/main" noChangeAspect="1"/>
@@ -176,7 +176,7 @@
                         <pic:spPr bwMode="auto">
                           <a:xfrm>
                             <a:off x="0" y="0"/>
-                            <a:ext cx="1428750" cy="2019048"/>
+                            <a:ext cx="1428750" cy="914479"/>
                           </a:xfrm>
                           <a:prstGeom prst="rect">
                             <a:avLst/>
@@ -316,7 +316,7 @@
                 <w:szCs w:val="22"/>
               </w:rPr>
               <w:drawing>
-                <wp:inline distT="0" distB="0" distL="0" distR="0" wp14:anchorId="27A1E9A1" wp14:editId="25FD4990">
+                <wp:inline distT="0" distB="0" distL="0" distR="0" wp14:anchorId="0C02F9F8" wp14:editId="61F475E9">
                   <wp:extent cx="1092200" cy="1092200"/>
                   <wp:effectExtent l="0" t="0" r="0" b="0"/>
                   <wp:docPr id="3" name="Afbeelding 3" descr="QR-code"/>
@@ -853,11 +853,10 @@
                 <w:sz w:val="22"/>
                 <w:szCs w:val="22"/>
               </w:rPr>
-              <w:lastRenderedPageBreak/>
               <w:drawing>
-                <wp:inline distT="0" distB="0" distL="0" distR="0" wp14:anchorId="728CCDE7" wp14:editId="7A1F834E">
-                  <wp:extent cx="908050" cy="2019048"/>
-                  <wp:effectExtent l="0" t="0" r="6350" b="635"/>
+                <wp:inline distT="0" distB="0" distL="0" distR="0" wp14:anchorId="4821D4C4" wp14:editId="7E7B7996">
+                  <wp:extent cx="908050" cy="914479"/>
+                  <wp:effectExtent l="0" t="0" r="6350" b="0"/>
                   <wp:docPr id="4" name="Afbeelding 4" descr="Partner-logo"/>
                   <wp:cNvGraphicFramePr>
                     <a:graphicFrameLocks xmlns:a="http://schemas.openxmlformats.org/drawingml/2006/main" noChangeAspect="1"/>
@@ -887,7 +886,7 @@
                         <pic:spPr bwMode="auto">
                           <a:xfrm>
                             <a:off x="0" y="0"/>
-                            <a:ext cx="908050" cy="2019048"/>
+                            <a:ext cx="908050" cy="914479"/>
                           </a:xfrm>
                           <a:prstGeom prst="rect">
                             <a:avLst/>
@@ -1047,6 +1046,7 @@
         <w:rPr>
           <w:rFonts w:ascii="Arial" w:hAnsi="Arial" w:cs="Arial"/>
         </w:rPr>
+        <w:lastRenderedPageBreak/>
         <w:t>Vragen? Mail Mark Smulders (de maker): marksmulders1973@gmail.com</w:t>
       </w:r>
     </w:p>

</xml_diff>